<commit_message>
Add the clean-run and LangChain/LangGraph/LangSmith addenda to the Stage 5 revision log workbook, matching docs/PRD_REVISION_LOG.md
</commit_message>
<xml_diff>
--- a/docs/workbooks/Stage_5_PRD_Revision_Log.docx
+++ b/docs/workbooks/Stage_5_PRD_Revision_Log.docx
@@ -2907,6 +2907,74 @@
         <w:spacing w:after="80"/>
       </w:pPr>
     </w:p>
+    <w:p>
+      <w:pPr>
+        <w:spacing w:before="440" w:after="60"/>
+      </w:pPr>
+      <w:r>
+        <w:rPr>
+          <w:b/>
+          <w:color w:val="E8660A"/>
+          <w:sz w:val="34"/>
+        </w:rPr>
+        <w:t xml:space="preserve">6   </w:t>
+      </w:r>
+      <w:r>
+        <w:rPr>
+          <w:b/>
+          <w:color w:val="1A1A2E"/>
+          <w:sz w:val="34"/>
+        </w:rPr>
+        <w:t>Addendum: later findings, 2026-09-17</w:t>
+      </w:r>
+    </w:p>
+    <w:p>
+      <w:pPr>
+        <w:spacing w:after="140"/>
+      </w:pPr>
+      <w:r>
+        <w:rPr>
+          <w:sz w:val="21"/>
+        </w:rPr>
+        <w:t>Everything above was written on 2026-09-16, from two evaluation runs that both turned out to be dominated by Groq's daily token quota. Two things changed since then. Both are recorded here in full rather than left as a gap between this workbook and the project's own longer-form revision log, docs/PRD_REVISION_LOG.md, which carries the same two addenda with more supporting detail and a comparison table.</w:t>
+      </w:r>
+    </w:p>
+    <w:p>
+      <w:pPr>
+        <w:spacing w:after="140"/>
+      </w:pPr>
+      <w:r>
+        <w:rPr>
+          <w:b/>
+          <w:sz w:val="21"/>
+        </w:rPr>
+        <w:t xml:space="preserve">A clean evaluation run, 2026-09-17. </w:t>
+      </w:r>
+      <w:r>
+        <w:rPr>
+          <w:sz w:val="21"/>
+        </w:rPr>
+        <w:t>On 2026-09-17, once that day's quota had reset, the 80-ticket validation set was rerun through the unchanged pipeline with zero fallbacks. It produced a real, non-quota-contaminated data point: 81.25% FCR and 18.75% escalation, both clearing the version-two targets in the changes table above. It also corrected the NFR-01 latency explanation: the dominant driver of tail latency is the generation call's own inference time on Groq's free tier, not retry backoff under rate limiting, since this clean run has zero retries yet a p95 (10.64s) close to the quota-contaminated 500-ticket run's (10.35s). It also reopened a question the 500-ticket run had appeared to settle: a 21.9-point customer-tier resolution spread (business 93.33%, standard 71.43%, enterprise 87.5%), well outside the 5-point NFR-07 threshold, though the segments here are small (n=30 to n=42) and this could be noise rather than a real effect. The fluency-fairness finding, by contrast, replicated cleanly in the same direction as the 500-ticket run.</w:t>
+      </w:r>
+    </w:p>
+    <w:p>
+      <w:pPr>
+        <w:spacing w:after="140"/>
+      </w:pPr>
+      <w:r>
+        <w:rPr>
+          <w:b/>
+          <w:sz w:val="21"/>
+        </w:rPr>
+        <w:t xml:space="preserve">The LangChain/LangGraph/LangSmith branch, 2026-09-17. </w:t>
+      </w:r>
+      <w:r>
+        <w:rPr>
+          <w:sz w:val="21"/>
+        </w:rPr>
+        <w:t>A second branch, langchain-langgraph-migration, was built on 2026-09-17 to demonstrate an alternative the capstone report's own “alternatives considered” table had already named and set aside: using LangChain and LangGraph for orchestration. It produced no entry in the changes table above because no functional or non-functional requirement changed: every public interface, the ChatClient protocol, the retriever's public methods, every component function's signature, and run_ticket()'s own signature and return type, stayed identical to master, and all 53 existing tests pass unchanged on the new branch. FR-10's decision-logging requirement is still met the same way, by the SQLite decision log, on both branches. The one new thing this branch adds, LangSmith tracing, is documented as an optional, off-by-default observability layer, not a requirement. master is kept as the comparison baseline; langchain-langgraph-migration is the branch used for demos going forward.</w:t>
+      </w:r>
+    </w:p>
     <w:sectPr>
       <w:footerReference w:type="default" r:id="rId10"/>
       <w:pgSz w:w="12240" w:h="15840"/>

</xml_diff>